<commit_message>
Add Hebrew peer-reviewed sources to the essay
Integrate two open-access Hebrew academic sources (Davidovitch & Wadmany,
2025; Mishar-Tal, 2023) into the body and reference list.

Co-Authored-By: Claude Opus 4.8 <noreply@anthropic.com>
Claude-Session: https://claude.ai/code/session_01KsMPw6kVH78moeL14DLFvA
</commit_message>
<xml_diff>
--- a/מאמר_עיוני_בינה_מלאכותית_בחינוך.docx
+++ b/מאמר_עיוני_בינה_מלאכותית_בחינוך.docx
@@ -138,6 +138,23 @@
           <w:szCs w:val="24"/>
           <w:rtl w:val="1"/>
         </w:rPr>
+        <w:t>גם בשיח האקדמי בישראל מתגבשת אותה תובנה. סקירה של אתגרי השימוש ב-ChatGPT בהוראה ובלמידה בהשכלה הגבוהה הצביעה על כך שהכלי מזמן הזדמנויות של פרסונליזציה, הנגשת ידע וייעול תהליכי כתיבה, אך בה בעת מחייב את המוסדות לחשוב מחדש על דרכי ההערכה ועל מידת האחריות של הלומד לתוצר שהוא מגיש. לא מדובר בשאלה טכנית של איסור או היתר, אלא בשינוי עמוק באופן שבו נבנית הלמידה (מישר-טל, 2023).</w:t>
+      </w:r>
+    </w:p>
+    <w:p>
+      <w:pPr>
+        <w:bidi/>
+        <w:spacing w:line="360" w:lineRule="auto" w:after="200" w:before="0"/>
+        <w:jc w:val="both"/>
+      </w:pPr>
+      <w:r>
+        <w:rPr>
+          <w:rFonts w:ascii="David" w:hAnsi="David" w:cs="David"/>
+          <w:b w:val="0"/>
+          <w:sz w:val="24"/>
+          <w:szCs w:val="24"/>
+          <w:rtl w:val="1"/>
+        </w:rPr>
         <w:t>עדות ממוקדת יותר עולה ממחקר שעקב אחר האופן שבו סטודנטים מנהלים בפועל דיאלוג עם ChatGPT. החוקרים זיהו שני דפוסי שימוש נבדלים. בדפוס האחד הסטודנט מוסר לכלי את המשימה ומקבל תשובה מוגמרת, בלי לעבד אותה. בדפוס השני הוא מתדיין עם הכלי, מאתגר את תשובותיו ומשלב אותן בחשיבה שלו. רק בדפוס השני, השיתופי והמודרך, הושלמו כל שלבי הנוכחות הקוגניטיבית והחשיבה הביקורתית אכן התחזקה. כשההסתמכות הייתה פסיבית, התהליך נעצר באמצע (Nasr et al., 2025).</w:t>
       </w:r>
     </w:p>
@@ -209,6 +226,23 @@
           <w:rtl w:val="1"/>
         </w:rPr>
         <w:t>הסיכון אינו קוגניטיבי בלבד, הוא נוגע גם בלב היושרה האקדמית. מודלים של שפה מסוגלים להפיק טקסט מקורי, קוהרנטי וקולח, שקשה לכלי הזיהוי הקיימים ולעין מנוסה של בודק להבחין בו כפרי מכונה. זהו איום ממשי על היכולת להעריך למידה דרך עבודות כתובות. עם זאת אותו מחבר מסרב לפסול את הכלי על הסף, ומצביע גם על שימושים לגיטימיים בהוראת כתיבה ובתמיכה בלומדים, ובלבד שהמוסדות יגדירו כללים ברורים (Perkins, 2023).</w:t>
+      </w:r>
+    </w:p>
+    <w:p>
+      <w:pPr>
+        <w:bidi/>
+        <w:spacing w:line="360" w:lineRule="auto" w:after="200" w:before="0"/>
+        <w:jc w:val="both"/>
+      </w:pPr>
+      <w:r>
+        <w:rPr>
+          <w:rFonts w:ascii="David" w:hAnsi="David" w:cs="David"/>
+          <w:b w:val="0"/>
+          <w:sz w:val="24"/>
+          <w:szCs w:val="24"/>
+          <w:rtl w:val="1"/>
+        </w:rPr>
+        <w:t>תמונה דומה עולה מן ההקשר הישראלי. מחקר שבחן את עמדותיהם האתיות של סטודנטים כלפי שימוש בבינה מלאכותית מצא פער בין מדיניות מוסדית הנשענת על עקרונות של יושרה אקדמית לבין מציאות לימודית שבה הסטודנטים פועלים תחת לחצי שוק עבודה שמצפה מהם לשלוט בטכנולוגיות מתקדמות. הממצא המעניין הוא שהסטודנטים אינם מבקשים רק כללים ברורים יותר, הם מצפים מן המרצים עצמם להנחות אותם כיצד להשתמש בכלי בצורה אתית (דוידוביץ' וודמני, 2025).</w:t>
       </w:r>
     </w:p>
     <w:p>
@@ -365,6 +399,42 @@
           <w:bCs/>
         </w:rPr>
         <w:t>רשימת מקורות</w:t>
+      </w:r>
+    </w:p>
+    <w:p>
+      <w:pPr>
+        <w:bidi/>
+        <w:spacing w:line="360" w:lineRule="auto" w:after="160"/>
+        <w:ind w:right="560" w:hanging="560"/>
+        <w:jc w:val="both"/>
+      </w:pPr>
+      <w:r>
+        <w:rPr>
+          <w:rFonts w:ascii="David" w:hAnsi="David" w:cs="David"/>
+          <w:b w:val="0"/>
+          <w:sz w:val="24"/>
+          <w:szCs w:val="24"/>
+          <w:rtl w:val="1"/>
+        </w:rPr>
+        <w:t>דוידוביץ', נ' וודמני, ר' (2025). בינה מלאכותית ואתיקה אקדמית: תפיסות סטודנטים וציפיותיהם מהמרצים. דפים (פרסום מקוון מוקדם). מכון מופ"ת. https://dapim.mofet.macam.ac.il</w:t>
+      </w:r>
+    </w:p>
+    <w:p>
+      <w:pPr>
+        <w:bidi/>
+        <w:spacing w:line="360" w:lineRule="auto" w:after="160"/>
+        <w:ind w:right="560" w:hanging="560"/>
+        <w:jc w:val="both"/>
+      </w:pPr>
+      <w:r>
+        <w:rPr>
+          <w:rFonts w:ascii="David" w:hAnsi="David" w:cs="David"/>
+          <w:b w:val="0"/>
+          <w:sz w:val="24"/>
+          <w:szCs w:val="24"/>
+          <w:rtl w:val="1"/>
+        </w:rPr>
+        <w:t>מישר-טל, ח' (2023). למידה והוראה בעידן הבינה המלאכותית: אתגרי השימוש ב-ChatGPT. גילוי דעת, 22. סמינר הקיבוצים. https://www.smkb.ac.il</w:t>
       </w:r>
     </w:p>
     <w:p>

</xml_diff>